<commit_message>
feat: add documentation and reports for week 6 project progress
</commit_message>
<xml_diff>
--- a/Messages/semaine6.docx
+++ b/Messages/semaine6.docx
@@ -242,6 +242,61 @@
         <w:t xml:space="preserve"> »</w:t>
       </w:r>
     </w:p>
+    <w:p/>
+    <w:p/>
+    <w:p>
+      <w:r>
+        <w:t>Bonjour à toutes et à tous,</w:t>
+      </w:r>
+    </w:p>
+    <w:p>
+      <w:r>
+        <w:t>Je tenais tout d'abord à saluer les efforts fournis par la cohorte depuis le début de la semaine. Suite aux messages transmis ces derniers jours, j'ai constaté un net regain d'activité sur la plateforme ainsi qu'une belle progression dans la validation des modules. C'est un signal très positif qui démontre votre volonté de garder le cap vers le début du Projet Professionnel.</w:t>
+      </w:r>
+    </w:p>
+    <w:p>
+      <w:r>
+        <w:lastRenderedPageBreak/>
+        <w:t>Dans cette dynamique encourageante, nous nous retrouverons ce soir en visioconférence pour notre rendez-vous du vendredi. À ce sujet, la Thématique 3 portant sur le Copywriting n'a pas encore été attribuée. J'invite toute personne ou petit groupe souhaitant aborder ce sujet à me contacter rapidement. C'est une excellente occasion de travailler votre prise de parole et d'ancrer vos compétences rédactionnelles au sein de la Séquence 4.</w:t>
+      </w:r>
+    </w:p>
+    <w:p>
+      <w:r>
+        <w:t>Enfin, la seconde partie de notre session sera dédiée à un atelier pratique sur la création de contenu. Si vous avez développé des méthodes personnelles, identifié des outils utiles ou trouvé des astuces pour faciliter vos productions graphiques ou rédactionnelles, je vous invite à vous faire connaître par retour de mail. Nous serons ravis de vous laisser la parole durant la session afin que vous puissiez partager vos découvertes avec l'ensemble du groupe.</w:t>
+      </w:r>
+    </w:p>
+    <w:p>
+      <w:r>
+        <w:t>Je vous félicite encore pour votre réactivité cette semaine, vous souhaite une excellente journée et vous donne rendez-vous ce soir en direct.</w:t>
+      </w:r>
+    </w:p>
+    <w:p>
+      <w:r>
+        <w:t>Bien cordialement,</w:t>
+      </w:r>
+    </w:p>
+    <w:p>
+      <w:r>
+        <w:t>ADIRIGNO OGOULA Jesse</w:t>
+      </w:r>
+      <w:r>
+        <w:br/>
+        <w:t>Tuteur en Marketing Numérique</w:t>
+      </w:r>
+      <w:r>
+        <w:br/>
+        <w:t>Projet « D-CLIC, formez-vous au numérique avec l’</w:t>
+      </w:r>
+      <w:proofErr w:type="spellStart"/>
+      <w:r>
+        <w:t>OIF</w:t>
+      </w:r>
+      <w:proofErr w:type="spellEnd"/>
+      <w:r>
+        <w:t xml:space="preserve"> »</w:t>
+      </w:r>
+    </w:p>
+    <w:p/>
     <w:p/>
     <w:p/>
     <w:p/>

</xml_diff>